<commit_message>
Add Windows preview launcher and update CV and UFOs acceptance
</commit_message>
<xml_diff>
--- a/JiachengGao-CV/Jiacheng Gao CV.docx
+++ b/JiachengGao-CV/Jiacheng Gao CV.docx
@@ -1,6 +1,6 @@
 
 <file path=word/document.xml><?xml version="1.0" encoding="utf-8"?>
-<w:document xmlns:wpc="http://schemas.microsoft.com/office/word/2010/wordprocessingCanvas" xmlns:cx="http://schemas.microsoft.com/office/drawing/2014/chartex" xmlns:cx1="http://schemas.microsoft.com/office/drawing/2015/9/8/chartex" xmlns:cx2="http://schemas.microsoft.com/office/drawing/2015/10/21/chartex" xmlns:cx3="http://schemas.microsoft.com/office/drawing/2016/5/9/chartex" xmlns:cx4="http://schemas.microsoft.com/office/drawing/2016/5/10/chartex" xmlns:cx5="http://schemas.microsoft.com/office/drawing/2016/5/11/chartex" xmlns:cx6="http://schemas.microsoft.com/office/drawing/2016/5/12/chartex" xmlns:cx7="http://schemas.microsoft.com/office/drawing/2016/5/13/chartex" xmlns:cx8="http://schemas.microsoft.com/office/drawing/2016/5/14/chartex" xmlns:mc="http://schemas.openxmlformats.org/markup-compatibility/2006" xmlns:aink="http://schemas.microsoft.com/office/drawing/2016/ink" xmlns:am3d="http://schemas.microsoft.com/office/drawing/2017/model3d" xmlns:o="urn:schemas-microsoft-com:office:office" xmlns:oel="http://schemas.microsoft.com/office/2019/extlst" xmlns:r="http://schemas.openxmlformats.org/officeDocument/2006/relationships" xmlns:m="http://schemas.openxmlformats.org/officeDocument/2006/math" xmlns:v="urn:schemas-microsoft-com:vml" xmlns:wp14="http://schemas.microsoft.com/office/word/2010/wordprocessingDrawing" xmlns:wp="http://schemas.openxmlformats.org/drawingml/2006/wordprocessingDrawing" xmlns:w10="urn:schemas-microsoft-com:office:word" xmlns:w="http://schemas.openxmlformats.org/wordprocessingml/2006/main" xmlns:w14="http://schemas.microsoft.com/office/word/2010/wordml" xmlns:w15="http://schemas.microsoft.com/office/word/2012/wordml" xmlns:w16cex="http://schemas.microsoft.com/office/word/2018/wordml/cex" xmlns:w16cid="http://schemas.microsoft.com/office/word/2016/wordml/cid" xmlns:w16="http://schemas.microsoft.com/office/word/2018/wordml" xmlns:w16du="http://schemas.microsoft.com/office/word/2023/wordml/word16du" xmlns:w16sdtdh="http://schemas.microsoft.com/office/word/2020/wordml/sdtdatahash" xmlns:w16sdtfl="http://schemas.microsoft.com/office/word/2024/wordml/sdtformatlock" xmlns:w16se="http://schemas.microsoft.com/office/word/2015/wordml/symex" xmlns:wpg="http://schemas.microsoft.com/office/word/2010/wordprocessingGroup" xmlns:wpi="http://schemas.microsoft.com/office/word/2010/wordprocessingInk" xmlns:wne="http://schemas.microsoft.com/office/word/2006/wordml" xmlns:wps="http://schemas.microsoft.com/office/word/2010/wordprocessingShape" mc:Ignorable="w14 w15 w16se w16cid w16 w16cex w16sdtdh w16sdtfl w16du wp14">
+<w:document xmlns:wpc="http://schemas.microsoft.com/office/word/2010/wordprocessingCanvas" xmlns:cx="http://schemas.microsoft.com/office/drawing/2014/chartex" xmlns:cx1="http://schemas.microsoft.com/office/drawing/2015/9/8/chartex" xmlns:cx2="http://schemas.microsoft.com/office/drawing/2015/10/21/chartex" xmlns:cx3="http://schemas.microsoft.com/office/drawing/2016/5/9/chartex" xmlns:cx4="http://schemas.microsoft.com/office/drawing/2016/5/10/chartex" xmlns:cx5="http://schemas.microsoft.com/office/drawing/2016/5/11/chartex" xmlns:cx6="http://schemas.microsoft.com/office/drawing/2016/5/12/chartex" xmlns:cx7="http://schemas.microsoft.com/office/drawing/2016/5/13/chartex" xmlns:cx8="http://schemas.microsoft.com/office/drawing/2016/5/14/chartex" xmlns:mc="http://schemas.openxmlformats.org/markup-compatibility/2006" xmlns:aink="http://schemas.microsoft.com/office/drawing/2016/ink" xmlns:am3d="http://schemas.microsoft.com/office/drawing/2017/model3d" xmlns:o="urn:schemas-microsoft-com:office:office" xmlns:oel="http://schemas.microsoft.com/office/2019/extlst" xmlns:r="http://schemas.openxmlformats.org/officeDocument/2006/relationships" xmlns:m="http://schemas.openxmlformats.org/officeDocument/2006/math" xmlns:v="urn:schemas-microsoft-com:vml" xmlns:wp14="http://schemas.microsoft.com/office/word/2010/wordprocessingDrawing" xmlns:wp="http://schemas.openxmlformats.org/drawingml/2006/wordprocessingDrawing" xmlns:w10="urn:schemas-microsoft-com:office:word" xmlns:w="http://schemas.openxmlformats.org/wordprocessingml/2006/main" xmlns:w14="http://schemas.microsoft.com/office/word/2010/wordml" xmlns:w15="http://schemas.microsoft.com/office/word/2012/wordml" xmlns:w16cex="http://schemas.microsoft.com/office/word/2018/wordml/cex" xmlns:w16cid="http://schemas.microsoft.com/office/word/2016/wordml/cid" xmlns:w16="http://schemas.microsoft.com/office/word/2018/wordml" xmlns:w16sdtdh="http://schemas.microsoft.com/office/word/2020/wordml/sdtdatahash" xmlns:w16se="http://schemas.microsoft.com/office/word/2015/wordml/symex" xmlns:wpg="http://schemas.microsoft.com/office/word/2010/wordprocessingGroup" xmlns:wpi="http://schemas.microsoft.com/office/word/2010/wordprocessingInk" xmlns:wne="http://schemas.microsoft.com/office/word/2006/wordml" xmlns:wps="http://schemas.microsoft.com/office/word/2010/wordprocessingShape" mc:Ignorable="w14 w15 w16se w16cid w16 w16cex w16sdtdh wp14">
   <w:body>
     <w:p>
       <w:pPr>
@@ -1387,19 +1387,34 @@
           <w:sz w:val="21"/>
           <w:szCs w:val="21"/>
         </w:rPr>
-        <w:t>Co-authored three papers (details in publication section).</w:t>
-      </w:r>
-    </w:p>
-    <w:p>
-      <w:pPr>
-        <w:widowControl/>
-        <w:spacing w:after="0"/>
-        <w:rPr>
-          <w:rFonts w:ascii="Times New Roman" w:hAnsi="Times New Roman" w:cs="Times New Roman"/>
-          <w:sz w:val="21"/>
-          <w:szCs w:val="21"/>
-        </w:rPr>
-      </w:pPr>
+        <w:t>Co-authored three papers</w:t>
+      </w:r>
+      <w:r>
+        <w:rPr>
+          <w:rFonts w:ascii="Times New Roman" w:hAnsi="Times New Roman" w:cs="Times New Roman"/>
+          <w:sz w:val="21"/>
+          <w:szCs w:val="21"/>
+        </w:rPr>
+        <w:t xml:space="preserve">, accepted to </w:t>
+      </w:r>
+      <w:proofErr w:type="spellStart"/>
+      <w:r>
+        <w:rPr>
+          <w:rFonts w:ascii="Times New Roman" w:hAnsi="Times New Roman" w:cs="Times New Roman"/>
+          <w:sz w:val="21"/>
+          <w:szCs w:val="21"/>
+        </w:rPr>
+        <w:t>Asiacrypt</w:t>
+      </w:r>
+      <w:proofErr w:type="spellEnd"/>
+      <w:r>
+        <w:rPr>
+          <w:rFonts w:ascii="Times New Roman" w:hAnsi="Times New Roman" w:cs="Times New Roman"/>
+          <w:sz w:val="21"/>
+          <w:szCs w:val="21"/>
+        </w:rPr>
+        <w:t xml:space="preserve"> 26, TIFS, JCS, respectively.</w:t>
+      </w:r>
     </w:p>
     <w:p>
       <w:pPr>
@@ -1808,7 +1823,37 @@
           <w:sz w:val="21"/>
           <w:szCs w:val="21"/>
         </w:rPr>
-        <w:t>Manuscript in preparation</w:t>
+        <w:t xml:space="preserve">Transactions on Information Forensics </w:t>
+      </w:r>
+      <w:r>
+        <w:rPr>
+          <w:rFonts w:ascii="Times New Roman" w:hAnsi="Times New Roman" w:cs="Times New Roman"/>
+          <w:i/>
+          <w:iCs/>
+          <w:sz w:val="21"/>
+          <w:szCs w:val="21"/>
+        </w:rPr>
+        <w:t>and</w:t>
+      </w:r>
+      <w:r>
+        <w:rPr>
+          <w:rFonts w:ascii="Times New Roman" w:hAnsi="Times New Roman" w:cs="Times New Roman"/>
+          <w:i/>
+          <w:iCs/>
+          <w:sz w:val="21"/>
+          <w:szCs w:val="21"/>
+        </w:rPr>
+        <w:t xml:space="preserve"> Security</w:t>
+      </w:r>
+      <w:r>
+        <w:rPr>
+          <w:rFonts w:ascii="Times New Roman" w:hAnsi="Times New Roman" w:cs="Times New Roman"/>
+          <w:i/>
+          <w:iCs/>
+          <w:sz w:val="21"/>
+          <w:szCs w:val="21"/>
+        </w:rPr>
+        <w:t xml:space="preserve"> (TIFS)</w:t>
       </w:r>
       <w:r>
         <w:rPr>
@@ -2314,7 +2359,6 @@
           <w:bCs/>
           <w:u w:val="single"/>
         </w:rPr>
-        <w:lastRenderedPageBreak/>
         <w:t>HONORS</w:t>
       </w:r>
       <w:r>
@@ -2383,6 +2427,7 @@
           <w:sz w:val="21"/>
           <w:szCs w:val="21"/>
         </w:rPr>
+        <w:lastRenderedPageBreak/>
         <w:t xml:space="preserve">Outstanding Graduate </w:t>
       </w:r>
       <w:r>
@@ -2730,7 +2775,7 @@
 </file>
 
 <file path=word/endnotes.xml><?xml version="1.0" encoding="utf-8"?>
-<w:endnotes xmlns:wpc="http://schemas.microsoft.com/office/word/2010/wordprocessingCanvas" xmlns:cx="http://schemas.microsoft.com/office/drawing/2014/chartex" xmlns:cx1="http://schemas.microsoft.com/office/drawing/2015/9/8/chartex" xmlns:cx2="http://schemas.microsoft.com/office/drawing/2015/10/21/chartex" xmlns:cx3="http://schemas.microsoft.com/office/drawing/2016/5/9/chartex" xmlns:cx4="http://schemas.microsoft.com/office/drawing/2016/5/10/chartex" xmlns:cx5="http://schemas.microsoft.com/office/drawing/2016/5/11/chartex" xmlns:cx6="http://schemas.microsoft.com/office/drawing/2016/5/12/chartex" xmlns:cx7="http://schemas.microsoft.com/office/drawing/2016/5/13/chartex" xmlns:cx8="http://schemas.microsoft.com/office/drawing/2016/5/14/chartex" xmlns:mc="http://schemas.openxmlformats.org/markup-compatibility/2006" xmlns:aink="http://schemas.microsoft.com/office/drawing/2016/ink" xmlns:am3d="http://schemas.microsoft.com/office/drawing/2017/model3d" xmlns:o="urn:schemas-microsoft-com:office:office" xmlns:oel="http://schemas.microsoft.com/office/2019/extlst" xmlns:r="http://schemas.openxmlformats.org/officeDocument/2006/relationships" xmlns:m="http://schemas.openxmlformats.org/officeDocument/2006/math" xmlns:v="urn:schemas-microsoft-com:vml" xmlns:wp14="http://schemas.microsoft.com/office/word/2010/wordprocessingDrawing" xmlns:wp="http://schemas.openxmlformats.org/drawingml/2006/wordprocessingDrawing" xmlns:w10="urn:schemas-microsoft-com:office:word" xmlns:w="http://schemas.openxmlformats.org/wordprocessingml/2006/main" xmlns:w14="http://schemas.microsoft.com/office/word/2010/wordml" xmlns:w15="http://schemas.microsoft.com/office/word/2012/wordml" xmlns:w16cex="http://schemas.microsoft.com/office/word/2018/wordml/cex" xmlns:w16cid="http://schemas.microsoft.com/office/word/2016/wordml/cid" xmlns:w16="http://schemas.microsoft.com/office/word/2018/wordml" xmlns:w16du="http://schemas.microsoft.com/office/word/2023/wordml/word16du" xmlns:w16sdtdh="http://schemas.microsoft.com/office/word/2020/wordml/sdtdatahash" xmlns:w16sdtfl="http://schemas.microsoft.com/office/word/2024/wordml/sdtformatlock" xmlns:w16se="http://schemas.microsoft.com/office/word/2015/wordml/symex" xmlns:wpg="http://schemas.microsoft.com/office/word/2010/wordprocessingGroup" xmlns:wpi="http://schemas.microsoft.com/office/word/2010/wordprocessingInk" xmlns:wne="http://schemas.microsoft.com/office/word/2006/wordml" xmlns:wps="http://schemas.microsoft.com/office/word/2010/wordprocessingShape" mc:Ignorable="w14 w15 w16se w16cid w16 w16cex w16sdtdh w16sdtfl w16du wp14">
+<w:endnotes xmlns:wpc="http://schemas.microsoft.com/office/word/2010/wordprocessingCanvas" xmlns:cx="http://schemas.microsoft.com/office/drawing/2014/chartex" xmlns:cx1="http://schemas.microsoft.com/office/drawing/2015/9/8/chartex" xmlns:cx2="http://schemas.microsoft.com/office/drawing/2015/10/21/chartex" xmlns:cx3="http://schemas.microsoft.com/office/drawing/2016/5/9/chartex" xmlns:cx4="http://schemas.microsoft.com/office/drawing/2016/5/10/chartex" xmlns:cx5="http://schemas.microsoft.com/office/drawing/2016/5/11/chartex" xmlns:cx6="http://schemas.microsoft.com/office/drawing/2016/5/12/chartex" xmlns:cx7="http://schemas.microsoft.com/office/drawing/2016/5/13/chartex" xmlns:cx8="http://schemas.microsoft.com/office/drawing/2016/5/14/chartex" xmlns:mc="http://schemas.openxmlformats.org/markup-compatibility/2006" xmlns:aink="http://schemas.microsoft.com/office/drawing/2016/ink" xmlns:am3d="http://schemas.microsoft.com/office/drawing/2017/model3d" xmlns:o="urn:schemas-microsoft-com:office:office" xmlns:oel="http://schemas.microsoft.com/office/2019/extlst" xmlns:r="http://schemas.openxmlformats.org/officeDocument/2006/relationships" xmlns:m="http://schemas.openxmlformats.org/officeDocument/2006/math" xmlns:v="urn:schemas-microsoft-com:vml" xmlns:wp14="http://schemas.microsoft.com/office/word/2010/wordprocessingDrawing" xmlns:wp="http://schemas.openxmlformats.org/drawingml/2006/wordprocessingDrawing" xmlns:w10="urn:schemas-microsoft-com:office:word" xmlns:w="http://schemas.openxmlformats.org/wordprocessingml/2006/main" xmlns:w14="http://schemas.microsoft.com/office/word/2010/wordml" xmlns:w15="http://schemas.microsoft.com/office/word/2012/wordml" xmlns:w16cex="http://schemas.microsoft.com/office/word/2018/wordml/cex" xmlns:w16cid="http://schemas.microsoft.com/office/word/2016/wordml/cid" xmlns:w16="http://schemas.microsoft.com/office/word/2018/wordml" xmlns:w16sdtdh="http://schemas.microsoft.com/office/word/2020/wordml/sdtdatahash" xmlns:w16se="http://schemas.microsoft.com/office/word/2015/wordml/symex" xmlns:wpg="http://schemas.microsoft.com/office/word/2010/wordprocessingGroup" xmlns:wpi="http://schemas.microsoft.com/office/word/2010/wordprocessingInk" xmlns:wne="http://schemas.microsoft.com/office/word/2006/wordml" xmlns:wps="http://schemas.microsoft.com/office/word/2010/wordprocessingShape" mc:Ignorable="w14 w15 w16se w16cid w16 w16cex w16sdtdh wp14">
   <w:endnote w:type="separator" w:id="-1">
     <w:p>
       <w:pPr>
@@ -2755,7 +2800,7 @@
 </file>
 
 <file path=word/footnotes.xml><?xml version="1.0" encoding="utf-8"?>
-<w:footnotes xmlns:wpc="http://schemas.microsoft.com/office/word/2010/wordprocessingCanvas" xmlns:cx="http://schemas.microsoft.com/office/drawing/2014/chartex" xmlns:cx1="http://schemas.microsoft.com/office/drawing/2015/9/8/chartex" xmlns:cx2="http://schemas.microsoft.com/office/drawing/2015/10/21/chartex" xmlns:cx3="http://schemas.microsoft.com/office/drawing/2016/5/9/chartex" xmlns:cx4="http://schemas.microsoft.com/office/drawing/2016/5/10/chartex" xmlns:cx5="http://schemas.microsoft.com/office/drawing/2016/5/11/chartex" xmlns:cx6="http://schemas.microsoft.com/office/drawing/2016/5/12/chartex" xmlns:cx7="http://schemas.microsoft.com/office/drawing/2016/5/13/chartex" xmlns:cx8="http://schemas.microsoft.com/office/drawing/2016/5/14/chartex" xmlns:mc="http://schemas.openxmlformats.org/markup-compatibility/2006" xmlns:aink="http://schemas.microsoft.com/office/drawing/2016/ink" xmlns:am3d="http://schemas.microsoft.com/office/drawing/2017/model3d" xmlns:o="urn:schemas-microsoft-com:office:office" xmlns:oel="http://schemas.microsoft.com/office/2019/extlst" xmlns:r="http://schemas.openxmlformats.org/officeDocument/2006/relationships" xmlns:m="http://schemas.openxmlformats.org/officeDocument/2006/math" xmlns:v="urn:schemas-microsoft-com:vml" xmlns:wp14="http://schemas.microsoft.com/office/word/2010/wordprocessingDrawing" xmlns:wp="http://schemas.openxmlformats.org/drawingml/2006/wordprocessingDrawing" xmlns:w10="urn:schemas-microsoft-com:office:word" xmlns:w="http://schemas.openxmlformats.org/wordprocessingml/2006/main" xmlns:w14="http://schemas.microsoft.com/office/word/2010/wordml" xmlns:w15="http://schemas.microsoft.com/office/word/2012/wordml" xmlns:w16cex="http://schemas.microsoft.com/office/word/2018/wordml/cex" xmlns:w16cid="http://schemas.microsoft.com/office/word/2016/wordml/cid" xmlns:w16="http://schemas.microsoft.com/office/word/2018/wordml" xmlns:w16du="http://schemas.microsoft.com/office/word/2023/wordml/word16du" xmlns:w16sdtdh="http://schemas.microsoft.com/office/word/2020/wordml/sdtdatahash" xmlns:w16sdtfl="http://schemas.microsoft.com/office/word/2024/wordml/sdtformatlock" xmlns:w16se="http://schemas.microsoft.com/office/word/2015/wordml/symex" xmlns:wpg="http://schemas.microsoft.com/office/word/2010/wordprocessingGroup" xmlns:wpi="http://schemas.microsoft.com/office/word/2010/wordprocessingInk" xmlns:wne="http://schemas.microsoft.com/office/word/2006/wordml" xmlns:wps="http://schemas.microsoft.com/office/word/2010/wordprocessingShape" mc:Ignorable="w14 w15 w16se w16cid w16 w16cex w16sdtdh w16sdtfl w16du wp14">
+<w:footnotes xmlns:wpc="http://schemas.microsoft.com/office/word/2010/wordprocessingCanvas" xmlns:cx="http://schemas.microsoft.com/office/drawing/2014/chartex" xmlns:cx1="http://schemas.microsoft.com/office/drawing/2015/9/8/chartex" xmlns:cx2="http://schemas.microsoft.com/office/drawing/2015/10/21/chartex" xmlns:cx3="http://schemas.microsoft.com/office/drawing/2016/5/9/chartex" xmlns:cx4="http://schemas.microsoft.com/office/drawing/2016/5/10/chartex" xmlns:cx5="http://schemas.microsoft.com/office/drawing/2016/5/11/chartex" xmlns:cx6="http://schemas.microsoft.com/office/drawing/2016/5/12/chartex" xmlns:cx7="http://schemas.microsoft.com/office/drawing/2016/5/13/chartex" xmlns:cx8="http://schemas.microsoft.com/office/drawing/2016/5/14/chartex" xmlns:mc="http://schemas.openxmlformats.org/markup-compatibility/2006" xmlns:aink="http://schemas.microsoft.com/office/drawing/2016/ink" xmlns:am3d="http://schemas.microsoft.com/office/drawing/2017/model3d" xmlns:o="urn:schemas-microsoft-com:office:office" xmlns:oel="http://schemas.microsoft.com/office/2019/extlst" xmlns:r="http://schemas.openxmlformats.org/officeDocument/2006/relationships" xmlns:m="http://schemas.openxmlformats.org/officeDocument/2006/math" xmlns:v="urn:schemas-microsoft-com:vml" xmlns:wp14="http://schemas.microsoft.com/office/word/2010/wordprocessingDrawing" xmlns:wp="http://schemas.openxmlformats.org/drawingml/2006/wordprocessingDrawing" xmlns:w10="urn:schemas-microsoft-com:office:word" xmlns:w="http://schemas.openxmlformats.org/wordprocessingml/2006/main" xmlns:w14="http://schemas.microsoft.com/office/word/2010/wordml" xmlns:w15="http://schemas.microsoft.com/office/word/2012/wordml" xmlns:w16cex="http://schemas.microsoft.com/office/word/2018/wordml/cex" xmlns:w16cid="http://schemas.microsoft.com/office/word/2016/wordml/cid" xmlns:w16="http://schemas.microsoft.com/office/word/2018/wordml" xmlns:w16sdtdh="http://schemas.microsoft.com/office/word/2020/wordml/sdtdatahash" xmlns:w16se="http://schemas.microsoft.com/office/word/2015/wordml/symex" xmlns:wpg="http://schemas.microsoft.com/office/word/2010/wordprocessingGroup" xmlns:wpi="http://schemas.microsoft.com/office/word/2010/wordprocessingInk" xmlns:wne="http://schemas.microsoft.com/office/word/2006/wordml" xmlns:wps="http://schemas.microsoft.com/office/word/2010/wordprocessingShape" mc:Ignorable="w14 w15 w16se w16cid w16 w16cex w16sdtdh wp14">
   <w:footnote w:type="separator" w:id="-1">
     <w:p>
       <w:pPr>
@@ -2780,7 +2825,7 @@
 </file>
 
 <file path=word/header1.xml><?xml version="1.0" encoding="utf-8"?>
-<w:hdr xmlns:wpc="http://schemas.microsoft.com/office/word/2010/wordprocessingCanvas" xmlns:cx="http://schemas.microsoft.com/office/drawing/2014/chartex" xmlns:cx1="http://schemas.microsoft.com/office/drawing/2015/9/8/chartex" xmlns:cx2="http://schemas.microsoft.com/office/drawing/2015/10/21/chartex" xmlns:cx3="http://schemas.microsoft.com/office/drawing/2016/5/9/chartex" xmlns:cx4="http://schemas.microsoft.com/office/drawing/2016/5/10/chartex" xmlns:cx5="http://schemas.microsoft.com/office/drawing/2016/5/11/chartex" xmlns:cx6="http://schemas.microsoft.com/office/drawing/2016/5/12/chartex" xmlns:cx7="http://schemas.microsoft.com/office/drawing/2016/5/13/chartex" xmlns:cx8="http://schemas.microsoft.com/office/drawing/2016/5/14/chartex" xmlns:mc="http://schemas.openxmlformats.org/markup-compatibility/2006" xmlns:aink="http://schemas.microsoft.com/office/drawing/2016/ink" xmlns:am3d="http://schemas.microsoft.com/office/drawing/2017/model3d" xmlns:o="urn:schemas-microsoft-com:office:office" xmlns:oel="http://schemas.microsoft.com/office/2019/extlst" xmlns:r="http://schemas.openxmlformats.org/officeDocument/2006/relationships" xmlns:m="http://schemas.openxmlformats.org/officeDocument/2006/math" xmlns:v="urn:schemas-microsoft-com:vml" xmlns:wp14="http://schemas.microsoft.com/office/word/2010/wordprocessingDrawing" xmlns:wp="http://schemas.openxmlformats.org/drawingml/2006/wordprocessingDrawing" xmlns:w10="urn:schemas-microsoft-com:office:word" xmlns:w="http://schemas.openxmlformats.org/wordprocessingml/2006/main" xmlns:w14="http://schemas.microsoft.com/office/word/2010/wordml" xmlns:w15="http://schemas.microsoft.com/office/word/2012/wordml" xmlns:w16cex="http://schemas.microsoft.com/office/word/2018/wordml/cex" xmlns:w16cid="http://schemas.microsoft.com/office/word/2016/wordml/cid" xmlns:w16="http://schemas.microsoft.com/office/word/2018/wordml" xmlns:w16du="http://schemas.microsoft.com/office/word/2023/wordml/word16du" xmlns:w16sdtdh="http://schemas.microsoft.com/office/word/2020/wordml/sdtdatahash" xmlns:w16sdtfl="http://schemas.microsoft.com/office/word/2024/wordml/sdtformatlock" xmlns:w16se="http://schemas.microsoft.com/office/word/2015/wordml/symex" xmlns:wpg="http://schemas.microsoft.com/office/word/2010/wordprocessingGroup" xmlns:wpi="http://schemas.microsoft.com/office/word/2010/wordprocessingInk" xmlns:wne="http://schemas.microsoft.com/office/word/2006/wordml" xmlns:wps="http://schemas.microsoft.com/office/word/2010/wordprocessingShape" mc:Ignorable="w14 w15 w16se w16cid w16 w16cex w16sdtdh w16sdtfl w16du wp14">
+<w:hdr xmlns:wpc="http://schemas.microsoft.com/office/word/2010/wordprocessingCanvas" xmlns:cx="http://schemas.microsoft.com/office/drawing/2014/chartex" xmlns:cx1="http://schemas.microsoft.com/office/drawing/2015/9/8/chartex" xmlns:cx2="http://schemas.microsoft.com/office/drawing/2015/10/21/chartex" xmlns:cx3="http://schemas.microsoft.com/office/drawing/2016/5/9/chartex" xmlns:cx4="http://schemas.microsoft.com/office/drawing/2016/5/10/chartex" xmlns:cx5="http://schemas.microsoft.com/office/drawing/2016/5/11/chartex" xmlns:cx6="http://schemas.microsoft.com/office/drawing/2016/5/12/chartex" xmlns:cx7="http://schemas.microsoft.com/office/drawing/2016/5/13/chartex" xmlns:cx8="http://schemas.microsoft.com/office/drawing/2016/5/14/chartex" xmlns:mc="http://schemas.openxmlformats.org/markup-compatibility/2006" xmlns:aink="http://schemas.microsoft.com/office/drawing/2016/ink" xmlns:am3d="http://schemas.microsoft.com/office/drawing/2017/model3d" xmlns:o="urn:schemas-microsoft-com:office:office" xmlns:oel="http://schemas.microsoft.com/office/2019/extlst" xmlns:r="http://schemas.openxmlformats.org/officeDocument/2006/relationships" xmlns:m="http://schemas.openxmlformats.org/officeDocument/2006/math" xmlns:v="urn:schemas-microsoft-com:vml" xmlns:wp14="http://schemas.microsoft.com/office/word/2010/wordprocessingDrawing" xmlns:wp="http://schemas.openxmlformats.org/drawingml/2006/wordprocessingDrawing" xmlns:w10="urn:schemas-microsoft-com:office:word" xmlns:w="http://schemas.openxmlformats.org/wordprocessingml/2006/main" xmlns:w14="http://schemas.microsoft.com/office/word/2010/wordml" xmlns:w15="http://schemas.microsoft.com/office/word/2012/wordml" xmlns:w16cex="http://schemas.microsoft.com/office/word/2018/wordml/cex" xmlns:w16cid="http://schemas.microsoft.com/office/word/2016/wordml/cid" xmlns:w16="http://schemas.microsoft.com/office/word/2018/wordml" xmlns:w16sdtdh="http://schemas.microsoft.com/office/word/2020/wordml/sdtdatahash" xmlns:w16se="http://schemas.microsoft.com/office/word/2015/wordml/symex" xmlns:wpg="http://schemas.microsoft.com/office/word/2010/wordprocessingGroup" xmlns:wpi="http://schemas.microsoft.com/office/word/2010/wordprocessingInk" xmlns:wne="http://schemas.microsoft.com/office/word/2006/wordml" xmlns:wps="http://schemas.microsoft.com/office/word/2010/wordprocessingShape" mc:Ignorable="w14 w15 w16se w16cid w16 w16cex w16sdtdh wp14">
   <w:p>
     <w:pPr>
       <w:pStyle w:val="a5"/>
@@ -2790,7 +2835,7 @@
 </file>
 
 <file path=word/numbering.xml><?xml version="1.0" encoding="utf-8"?>
-<w:numbering xmlns:wpc="http://schemas.microsoft.com/office/word/2010/wordprocessingCanvas" xmlns:cx="http://schemas.microsoft.com/office/drawing/2014/chartex" xmlns:cx1="http://schemas.microsoft.com/office/drawing/2015/9/8/chartex" xmlns:cx2="http://schemas.microsoft.com/office/drawing/2015/10/21/chartex" xmlns:cx3="http://schemas.microsoft.com/office/drawing/2016/5/9/chartex" xmlns:cx4="http://schemas.microsoft.com/office/drawing/2016/5/10/chartex" xmlns:cx5="http://schemas.microsoft.com/office/drawing/2016/5/11/chartex" xmlns:cx6="http://schemas.microsoft.com/office/drawing/2016/5/12/chartex" xmlns:cx7="http://schemas.microsoft.com/office/drawing/2016/5/13/chartex" xmlns:cx8="http://schemas.microsoft.com/office/drawing/2016/5/14/chartex" xmlns:mc="http://schemas.openxmlformats.org/markup-compatibility/2006" xmlns:aink="http://schemas.microsoft.com/office/drawing/2016/ink" xmlns:am3d="http://schemas.microsoft.com/office/drawing/2017/model3d" xmlns:o="urn:schemas-microsoft-com:office:office" xmlns:oel="http://schemas.microsoft.com/office/2019/extlst" xmlns:r="http://schemas.openxmlformats.org/officeDocument/2006/relationships" xmlns:m="http://schemas.openxmlformats.org/officeDocument/2006/math" xmlns:v="urn:schemas-microsoft-com:vml" xmlns:wp14="http://schemas.microsoft.com/office/word/2010/wordprocessingDrawing" xmlns:wp="http://schemas.openxmlformats.org/drawingml/2006/wordprocessingDrawing" xmlns:w10="urn:schemas-microsoft-com:office:word" xmlns:w="http://schemas.openxmlformats.org/wordprocessingml/2006/main" xmlns:w14="http://schemas.microsoft.com/office/word/2010/wordml" xmlns:w15="http://schemas.microsoft.com/office/word/2012/wordml" xmlns:w16cex="http://schemas.microsoft.com/office/word/2018/wordml/cex" xmlns:w16cid="http://schemas.microsoft.com/office/word/2016/wordml/cid" xmlns:w16="http://schemas.microsoft.com/office/word/2018/wordml" xmlns:w16du="http://schemas.microsoft.com/office/word/2023/wordml/word16du" xmlns:w16sdtdh="http://schemas.microsoft.com/office/word/2020/wordml/sdtdatahash" xmlns:w16sdtfl="http://schemas.microsoft.com/office/word/2024/wordml/sdtformatlock" xmlns:w16se="http://schemas.microsoft.com/office/word/2015/wordml/symex" xmlns:wpg="http://schemas.microsoft.com/office/word/2010/wordprocessingGroup" xmlns:wpi="http://schemas.microsoft.com/office/word/2010/wordprocessingInk" xmlns:wne="http://schemas.microsoft.com/office/word/2006/wordml" xmlns:wps="http://schemas.microsoft.com/office/word/2010/wordprocessingShape" mc:Ignorable="w14 w15 w16se w16cid w16 w16cex w16sdtdh w16sdtfl w16du wp14">
+<w:numbering xmlns:wpc="http://schemas.microsoft.com/office/word/2010/wordprocessingCanvas" xmlns:cx="http://schemas.microsoft.com/office/drawing/2014/chartex" xmlns:cx1="http://schemas.microsoft.com/office/drawing/2015/9/8/chartex" xmlns:cx2="http://schemas.microsoft.com/office/drawing/2015/10/21/chartex" xmlns:cx3="http://schemas.microsoft.com/office/drawing/2016/5/9/chartex" xmlns:cx4="http://schemas.microsoft.com/office/drawing/2016/5/10/chartex" xmlns:cx5="http://schemas.microsoft.com/office/drawing/2016/5/11/chartex" xmlns:cx6="http://schemas.microsoft.com/office/drawing/2016/5/12/chartex" xmlns:cx7="http://schemas.microsoft.com/office/drawing/2016/5/13/chartex" xmlns:cx8="http://schemas.microsoft.com/office/drawing/2016/5/14/chartex" xmlns:mc="http://schemas.openxmlformats.org/markup-compatibility/2006" xmlns:aink="http://schemas.microsoft.com/office/drawing/2016/ink" xmlns:am3d="http://schemas.microsoft.com/office/drawing/2017/model3d" xmlns:o="urn:schemas-microsoft-com:office:office" xmlns:oel="http://schemas.microsoft.com/office/2019/extlst" xmlns:r="http://schemas.openxmlformats.org/officeDocument/2006/relationships" xmlns:m="http://schemas.openxmlformats.org/officeDocument/2006/math" xmlns:v="urn:schemas-microsoft-com:vml" xmlns:wp14="http://schemas.microsoft.com/office/word/2010/wordprocessingDrawing" xmlns:wp="http://schemas.openxmlformats.org/drawingml/2006/wordprocessingDrawing" xmlns:w10="urn:schemas-microsoft-com:office:word" xmlns:w="http://schemas.openxmlformats.org/wordprocessingml/2006/main" xmlns:w14="http://schemas.microsoft.com/office/word/2010/wordml" xmlns:w15="http://schemas.microsoft.com/office/word/2012/wordml" xmlns:w16cex="http://schemas.microsoft.com/office/word/2018/wordml/cex" xmlns:w16cid="http://schemas.microsoft.com/office/word/2016/wordml/cid" xmlns:w16="http://schemas.microsoft.com/office/word/2018/wordml" xmlns:w16sdtdh="http://schemas.microsoft.com/office/word/2020/wordml/sdtdatahash" xmlns:w16se="http://schemas.microsoft.com/office/word/2015/wordml/symex" xmlns:wpg="http://schemas.microsoft.com/office/word/2010/wordprocessingGroup" xmlns:wpi="http://schemas.microsoft.com/office/word/2010/wordprocessingInk" xmlns:wne="http://schemas.microsoft.com/office/word/2006/wordml" xmlns:wps="http://schemas.microsoft.com/office/word/2010/wordprocessingShape" mc:Ignorable="w14 w15 w16se w16cid w16 w16cex w16sdtdh wp14">
   <w:abstractNum w:abstractNumId="0" w15:restartNumberingAfterBreak="0">
     <w:nsid w:val="0389405D"/>
     <w:multiLevelType w:val="multilevel"/>
@@ -4650,11 +4695,11 @@
 </file>
 
 <file path=word/styles.xml><?xml version="1.0" encoding="utf-8"?>
-<w:styles xmlns:mc="http://schemas.openxmlformats.org/markup-compatibility/2006" xmlns:r="http://schemas.openxmlformats.org/officeDocument/2006/relationships" xmlns:w="http://schemas.openxmlformats.org/wordprocessingml/2006/main" xmlns:w14="http://schemas.microsoft.com/office/word/2010/wordml" xmlns:w15="http://schemas.microsoft.com/office/word/2012/wordml" xmlns:w16cex="http://schemas.microsoft.com/office/word/2018/wordml/cex" xmlns:w16cid="http://schemas.microsoft.com/office/word/2016/wordml/cid" xmlns:w16="http://schemas.microsoft.com/office/word/2018/wordml" xmlns:w16du="http://schemas.microsoft.com/office/word/2023/wordml/word16du" xmlns:w16sdtdh="http://schemas.microsoft.com/office/word/2020/wordml/sdtdatahash" xmlns:w16sdtfl="http://schemas.microsoft.com/office/word/2024/wordml/sdtformatlock" xmlns:w16se="http://schemas.microsoft.com/office/word/2015/wordml/symex" mc:Ignorable="w14 w15 w16se w16cid w16 w16cex w16sdtdh w16sdtfl w16du">
+<w:styles xmlns:mc="http://schemas.openxmlformats.org/markup-compatibility/2006" xmlns:r="http://schemas.openxmlformats.org/officeDocument/2006/relationships" xmlns:w="http://schemas.openxmlformats.org/wordprocessingml/2006/main" xmlns:w14="http://schemas.microsoft.com/office/word/2010/wordml" xmlns:w15="http://schemas.microsoft.com/office/word/2012/wordml" xmlns:w16cex="http://schemas.microsoft.com/office/word/2018/wordml/cex" xmlns:w16cid="http://schemas.microsoft.com/office/word/2016/wordml/cid" xmlns:w16="http://schemas.microsoft.com/office/word/2018/wordml" xmlns:w16sdtdh="http://schemas.microsoft.com/office/word/2020/wordml/sdtdatahash" xmlns:w16se="http://schemas.microsoft.com/office/word/2015/wordml/symex" mc:Ignorable="w14 w15 w16se w16cid w16 w16cex w16sdtdh">
   <w:docDefaults>
     <w:rPrDefault>
       <w:rPr>
-        <w:rFonts w:ascii="Times New Roman" w:eastAsia="SimSun" w:hAnsi="Times New Roman" w:cs="Times New Roman"/>
+        <w:rFonts w:ascii="Times New Roman" w:eastAsia="宋体" w:hAnsi="Times New Roman" w:cs="Times New Roman"/>
         <w:lang w:val="en-US" w:eastAsia="zh-CN" w:bidi="ar-SA"/>
       </w:rPr>
     </w:rPrDefault>

</xml_diff>

<commit_message>
Correct undergraduate major in CV
</commit_message>
<xml_diff>
--- a/JiachengGao-CV/Jiacheng Gao CV.docx
+++ b/JiachengGao-CV/Jiacheng Gao CV.docx
@@ -1,6 +1,6 @@
 
 <file path=word/document.xml><?xml version="1.0" encoding="utf-8"?>
-<w:document xmlns:wpc="http://schemas.microsoft.com/office/word/2010/wordprocessingCanvas" xmlns:cx="http://schemas.microsoft.com/office/drawing/2014/chartex" xmlns:cx1="http://schemas.microsoft.com/office/drawing/2015/9/8/chartex" xmlns:cx2="http://schemas.microsoft.com/office/drawing/2015/10/21/chartex" xmlns:cx3="http://schemas.microsoft.com/office/drawing/2016/5/9/chartex" xmlns:cx4="http://schemas.microsoft.com/office/drawing/2016/5/10/chartex" xmlns:cx5="http://schemas.microsoft.com/office/drawing/2016/5/11/chartex" xmlns:cx6="http://schemas.microsoft.com/office/drawing/2016/5/12/chartex" xmlns:cx7="http://schemas.microsoft.com/office/drawing/2016/5/13/chartex" xmlns:cx8="http://schemas.microsoft.com/office/drawing/2016/5/14/chartex" xmlns:mc="http://schemas.openxmlformats.org/markup-compatibility/2006" xmlns:aink="http://schemas.microsoft.com/office/drawing/2016/ink" xmlns:am3d="http://schemas.microsoft.com/office/drawing/2017/model3d" xmlns:o="urn:schemas-microsoft-com:office:office" xmlns:oel="http://schemas.microsoft.com/office/2019/extlst" xmlns:r="http://schemas.openxmlformats.org/officeDocument/2006/relationships" xmlns:m="http://schemas.openxmlformats.org/officeDocument/2006/math" xmlns:v="urn:schemas-microsoft-com:vml" xmlns:wp14="http://schemas.microsoft.com/office/word/2010/wordprocessingDrawing" xmlns:wp="http://schemas.openxmlformats.org/drawingml/2006/wordprocessingDrawing" xmlns:w10="urn:schemas-microsoft-com:office:word" xmlns:w="http://schemas.openxmlformats.org/wordprocessingml/2006/main" xmlns:w14="http://schemas.microsoft.com/office/word/2010/wordml" xmlns:w15="http://schemas.microsoft.com/office/word/2012/wordml" xmlns:w16cex="http://schemas.microsoft.com/office/word/2018/wordml/cex" xmlns:w16cid="http://schemas.microsoft.com/office/word/2016/wordml/cid" xmlns:w16="http://schemas.microsoft.com/office/word/2018/wordml" xmlns:w16sdtdh="http://schemas.microsoft.com/office/word/2020/wordml/sdtdatahash" xmlns:w16se="http://schemas.microsoft.com/office/word/2015/wordml/symex" xmlns:wpg="http://schemas.microsoft.com/office/word/2010/wordprocessingGroup" xmlns:wpi="http://schemas.microsoft.com/office/word/2010/wordprocessingInk" xmlns:wne="http://schemas.microsoft.com/office/word/2006/wordml" xmlns:wps="http://schemas.microsoft.com/office/word/2010/wordprocessingShape" mc:Ignorable="w14 w15 w16se w16cid w16 w16cex w16sdtdh wp14">
+<w:document xmlns:wpc="http://schemas.microsoft.com/office/word/2010/wordprocessingCanvas" xmlns:cx="http://schemas.microsoft.com/office/drawing/2014/chartex" xmlns:cx1="http://schemas.microsoft.com/office/drawing/2015/9/8/chartex" xmlns:cx2="http://schemas.microsoft.com/office/drawing/2015/10/21/chartex" xmlns:cx3="http://schemas.microsoft.com/office/drawing/2016/5/9/chartex" xmlns:cx4="http://schemas.microsoft.com/office/drawing/2016/5/10/chartex" xmlns:cx5="http://schemas.microsoft.com/office/drawing/2016/5/11/chartex" xmlns:cx6="http://schemas.microsoft.com/office/drawing/2016/5/12/chartex" xmlns:cx7="http://schemas.microsoft.com/office/drawing/2016/5/13/chartex" xmlns:cx8="http://schemas.microsoft.com/office/drawing/2016/5/14/chartex" xmlns:mc="http://schemas.openxmlformats.org/markup-compatibility/2006" xmlns:m="http://schemas.openxmlformats.org/officeDocument/2006/math" xmlns:aink="http://schemas.microsoft.com/office/drawing/2016/ink" xmlns:am3d="http://schemas.microsoft.com/office/drawing/2017/model3d" xmlns:oel="http://schemas.microsoft.com/office/2019/extlst" xmlns:r="http://schemas.openxmlformats.org/officeDocument/2006/relationships" xmlns:wp14="http://schemas.microsoft.com/office/word/2010/wordprocessingDrawing" xmlns:wp="http://schemas.openxmlformats.org/drawingml/2006/wordprocessingDrawing" xmlns:wpg="http://schemas.microsoft.com/office/word/2010/wordprocessingGroup" xmlns:wpi="http://schemas.microsoft.com/office/word/2010/wordprocessingInk" xmlns:wps="http://schemas.microsoft.com/office/word/2010/wordprocessingShape" xmlns:o="urn:schemas-microsoft-com:office:office" xmlns:v="urn:schemas-microsoft-com:vml" xmlns:w10="urn:schemas-microsoft-com:office:word" xmlns:w="http://schemas.openxmlformats.org/wordprocessingml/2006/main" xmlns:w14="http://schemas.microsoft.com/office/word/2010/wordml" xmlns:w15="http://schemas.microsoft.com/office/word/2012/wordml" xmlns:w16cex="http://schemas.microsoft.com/office/word/2018/wordml/cex" xmlns:w16cid="http://schemas.microsoft.com/office/word/2016/wordml/cid" xmlns:w16="http://schemas.microsoft.com/office/word/2018/wordml" xmlns:w16sdtdh="http://schemas.microsoft.com/office/word/2020/wordml/sdtdatahash" xmlns:w16sdtfl="http://schemas.microsoft.com/office/word/2024/wordml/sdtformatlock" xmlns:w16se="http://schemas.microsoft.com/office/word/2015/wordml/symex" xmlns:w16du="http://schemas.microsoft.com/office/word/2023/wordml/word16du" xmlns:wne="http://schemas.microsoft.com/office/word/2006/wordml" mc:Ignorable="w14 w15 w16se w16cid w16 w16cex w16sdtdh w16sdtfl w16du wp14">
   <w:body>
     <w:p>
       <w:pPr>
@@ -450,27 +450,25 @@
           <w:sz w:val="21"/>
           <w:szCs w:val="21"/>
         </w:rPr>
-        <w:t>Bachelor of Science in Computer Science and Technology</w:t>
-      </w:r>
-      <w:r>
-        <w:rPr>
-          <w:rFonts w:ascii="Times New Roman" w:hAnsi="Times New Roman" w:cs="Times New Roman"/>
-          <w:b/>
-          <w:bCs/>
-          <w:sz w:val="21"/>
-          <w:szCs w:val="21"/>
-        </w:rPr>
-        <w:t xml:space="preserve"> </w:t>
-      </w:r>
-      <w:r>
-        <w:rPr>
-          <w:rFonts w:ascii="Times New Roman" w:hAnsi="Times New Roman" w:cs="Times New Roman"/>
-          <w:b/>
-          <w:bCs/>
-          <w:sz w:val="21"/>
-          <w:szCs w:val="21"/>
-        </w:rPr>
-        <w:tab/>
+        <w:t xml:space="preserve">Bachelor of Science in </w:t>
+      </w:r>
+      <w:r>
+        <w:rPr>
+          <w:rFonts w:ascii="Times New Roman" w:hAnsi="Times New Roman" w:cs="Times New Roman"/>
+          <w:sz w:val="21"/>
+          <w:szCs w:val="21"/>
+        </w:rPr>
+        <w:t>Information and Computational Science</w:t>
+      </w:r>
+      <w:r>
+        <w:rPr>
+          <w:rFonts w:ascii="Times New Roman" w:hAnsi="Times New Roman" w:cs="Times New Roman" w:hint="eastAsia"/>
+          <w:b/>
+          <w:bCs/>
+          <w:sz w:val="21"/>
+          <w:szCs w:val="21"/>
+        </w:rPr>
+        <w:t xml:space="preserve">  </w:t>
       </w:r>
       <w:r>
         <w:rPr>
@@ -2775,7 +2773,7 @@
 </file>
 
 <file path=word/endnotes.xml><?xml version="1.0" encoding="utf-8"?>
-<w:endnotes xmlns:wpc="http://schemas.microsoft.com/office/word/2010/wordprocessingCanvas" xmlns:cx="http://schemas.microsoft.com/office/drawing/2014/chartex" xmlns:cx1="http://schemas.microsoft.com/office/drawing/2015/9/8/chartex" xmlns:cx2="http://schemas.microsoft.com/office/drawing/2015/10/21/chartex" xmlns:cx3="http://schemas.microsoft.com/office/drawing/2016/5/9/chartex" xmlns:cx4="http://schemas.microsoft.com/office/drawing/2016/5/10/chartex" xmlns:cx5="http://schemas.microsoft.com/office/drawing/2016/5/11/chartex" xmlns:cx6="http://schemas.microsoft.com/office/drawing/2016/5/12/chartex" xmlns:cx7="http://schemas.microsoft.com/office/drawing/2016/5/13/chartex" xmlns:cx8="http://schemas.microsoft.com/office/drawing/2016/5/14/chartex" xmlns:mc="http://schemas.openxmlformats.org/markup-compatibility/2006" xmlns:aink="http://schemas.microsoft.com/office/drawing/2016/ink" xmlns:am3d="http://schemas.microsoft.com/office/drawing/2017/model3d" xmlns:o="urn:schemas-microsoft-com:office:office" xmlns:oel="http://schemas.microsoft.com/office/2019/extlst" xmlns:r="http://schemas.openxmlformats.org/officeDocument/2006/relationships" xmlns:m="http://schemas.openxmlformats.org/officeDocument/2006/math" xmlns:v="urn:schemas-microsoft-com:vml" xmlns:wp14="http://schemas.microsoft.com/office/word/2010/wordprocessingDrawing" xmlns:wp="http://schemas.openxmlformats.org/drawingml/2006/wordprocessingDrawing" xmlns:w10="urn:schemas-microsoft-com:office:word" xmlns:w="http://schemas.openxmlformats.org/wordprocessingml/2006/main" xmlns:w14="http://schemas.microsoft.com/office/word/2010/wordml" xmlns:w15="http://schemas.microsoft.com/office/word/2012/wordml" xmlns:w16cex="http://schemas.microsoft.com/office/word/2018/wordml/cex" xmlns:w16cid="http://schemas.microsoft.com/office/word/2016/wordml/cid" xmlns:w16="http://schemas.microsoft.com/office/word/2018/wordml" xmlns:w16sdtdh="http://schemas.microsoft.com/office/word/2020/wordml/sdtdatahash" xmlns:w16se="http://schemas.microsoft.com/office/word/2015/wordml/symex" xmlns:wpg="http://schemas.microsoft.com/office/word/2010/wordprocessingGroup" xmlns:wpi="http://schemas.microsoft.com/office/word/2010/wordprocessingInk" xmlns:wne="http://schemas.microsoft.com/office/word/2006/wordml" xmlns:wps="http://schemas.microsoft.com/office/word/2010/wordprocessingShape" mc:Ignorable="w14 w15 w16se w16cid w16 w16cex w16sdtdh wp14">
+<w:endnotes xmlns:wpc="http://schemas.microsoft.com/office/word/2010/wordprocessingCanvas" xmlns:cx="http://schemas.microsoft.com/office/drawing/2014/chartex" xmlns:cx1="http://schemas.microsoft.com/office/drawing/2015/9/8/chartex" xmlns:cx2="http://schemas.microsoft.com/office/drawing/2015/10/21/chartex" xmlns:cx3="http://schemas.microsoft.com/office/drawing/2016/5/9/chartex" xmlns:cx4="http://schemas.microsoft.com/office/drawing/2016/5/10/chartex" xmlns:cx5="http://schemas.microsoft.com/office/drawing/2016/5/11/chartex" xmlns:cx6="http://schemas.microsoft.com/office/drawing/2016/5/12/chartex" xmlns:cx7="http://schemas.microsoft.com/office/drawing/2016/5/13/chartex" xmlns:cx8="http://schemas.microsoft.com/office/drawing/2016/5/14/chartex" xmlns:mc="http://schemas.openxmlformats.org/markup-compatibility/2006" xmlns:m="http://schemas.openxmlformats.org/officeDocument/2006/math" xmlns:aink="http://schemas.microsoft.com/office/drawing/2016/ink" xmlns:am3d="http://schemas.microsoft.com/office/drawing/2017/model3d" xmlns:oel="http://schemas.microsoft.com/office/2019/extlst" xmlns:r="http://schemas.openxmlformats.org/officeDocument/2006/relationships" xmlns:wp14="http://schemas.microsoft.com/office/word/2010/wordprocessingDrawing" xmlns:wp="http://schemas.openxmlformats.org/drawingml/2006/wordprocessingDrawing" xmlns:wpg="http://schemas.microsoft.com/office/word/2010/wordprocessingGroup" xmlns:wpi="http://schemas.microsoft.com/office/word/2010/wordprocessingInk" xmlns:wps="http://schemas.microsoft.com/office/word/2010/wordprocessingShape" xmlns:o="urn:schemas-microsoft-com:office:office" xmlns:v="urn:schemas-microsoft-com:vml" xmlns:w10="urn:schemas-microsoft-com:office:word" xmlns:w="http://schemas.openxmlformats.org/wordprocessingml/2006/main" xmlns:w14="http://schemas.microsoft.com/office/word/2010/wordml" xmlns:w15="http://schemas.microsoft.com/office/word/2012/wordml" xmlns:w16cex="http://schemas.microsoft.com/office/word/2018/wordml/cex" xmlns:w16cid="http://schemas.microsoft.com/office/word/2016/wordml/cid" xmlns:w16="http://schemas.microsoft.com/office/word/2018/wordml" xmlns:w16sdtdh="http://schemas.microsoft.com/office/word/2020/wordml/sdtdatahash" xmlns:w16sdtfl="http://schemas.microsoft.com/office/word/2024/wordml/sdtformatlock" xmlns:w16se="http://schemas.microsoft.com/office/word/2015/wordml/symex" xmlns:w16du="http://schemas.microsoft.com/office/word/2023/wordml/word16du" xmlns:wne="http://schemas.microsoft.com/office/word/2006/wordml" mc:Ignorable="w14 w15 w16se w16cid w16 w16cex w16sdtdh w16sdtfl w16du wp14">
   <w:endnote w:type="separator" w:id="-1">
     <w:p>
       <w:pPr>
@@ -2800,7 +2798,7 @@
 </file>
 
 <file path=word/footnotes.xml><?xml version="1.0" encoding="utf-8"?>
-<w:footnotes xmlns:wpc="http://schemas.microsoft.com/office/word/2010/wordprocessingCanvas" xmlns:cx="http://schemas.microsoft.com/office/drawing/2014/chartex" xmlns:cx1="http://schemas.microsoft.com/office/drawing/2015/9/8/chartex" xmlns:cx2="http://schemas.microsoft.com/office/drawing/2015/10/21/chartex" xmlns:cx3="http://schemas.microsoft.com/office/drawing/2016/5/9/chartex" xmlns:cx4="http://schemas.microsoft.com/office/drawing/2016/5/10/chartex" xmlns:cx5="http://schemas.microsoft.com/office/drawing/2016/5/11/chartex" xmlns:cx6="http://schemas.microsoft.com/office/drawing/2016/5/12/chartex" xmlns:cx7="http://schemas.microsoft.com/office/drawing/2016/5/13/chartex" xmlns:cx8="http://schemas.microsoft.com/office/drawing/2016/5/14/chartex" xmlns:mc="http://schemas.openxmlformats.org/markup-compatibility/2006" xmlns:aink="http://schemas.microsoft.com/office/drawing/2016/ink" xmlns:am3d="http://schemas.microsoft.com/office/drawing/2017/model3d" xmlns:o="urn:schemas-microsoft-com:office:office" xmlns:oel="http://schemas.microsoft.com/office/2019/extlst" xmlns:r="http://schemas.openxmlformats.org/officeDocument/2006/relationships" xmlns:m="http://schemas.openxmlformats.org/officeDocument/2006/math" xmlns:v="urn:schemas-microsoft-com:vml" xmlns:wp14="http://schemas.microsoft.com/office/word/2010/wordprocessingDrawing" xmlns:wp="http://schemas.openxmlformats.org/drawingml/2006/wordprocessingDrawing" xmlns:w10="urn:schemas-microsoft-com:office:word" xmlns:w="http://schemas.openxmlformats.org/wordprocessingml/2006/main" xmlns:w14="http://schemas.microsoft.com/office/word/2010/wordml" xmlns:w15="http://schemas.microsoft.com/office/word/2012/wordml" xmlns:w16cex="http://schemas.microsoft.com/office/word/2018/wordml/cex" xmlns:w16cid="http://schemas.microsoft.com/office/word/2016/wordml/cid" xmlns:w16="http://schemas.microsoft.com/office/word/2018/wordml" xmlns:w16sdtdh="http://schemas.microsoft.com/office/word/2020/wordml/sdtdatahash" xmlns:w16se="http://schemas.microsoft.com/office/word/2015/wordml/symex" xmlns:wpg="http://schemas.microsoft.com/office/word/2010/wordprocessingGroup" xmlns:wpi="http://schemas.microsoft.com/office/word/2010/wordprocessingInk" xmlns:wne="http://schemas.microsoft.com/office/word/2006/wordml" xmlns:wps="http://schemas.microsoft.com/office/word/2010/wordprocessingShape" mc:Ignorable="w14 w15 w16se w16cid w16 w16cex w16sdtdh wp14">
+<w:footnotes xmlns:wpc="http://schemas.microsoft.com/office/word/2010/wordprocessingCanvas" xmlns:cx="http://schemas.microsoft.com/office/drawing/2014/chartex" xmlns:cx1="http://schemas.microsoft.com/office/drawing/2015/9/8/chartex" xmlns:cx2="http://schemas.microsoft.com/office/drawing/2015/10/21/chartex" xmlns:cx3="http://schemas.microsoft.com/office/drawing/2016/5/9/chartex" xmlns:cx4="http://schemas.microsoft.com/office/drawing/2016/5/10/chartex" xmlns:cx5="http://schemas.microsoft.com/office/drawing/2016/5/11/chartex" xmlns:cx6="http://schemas.microsoft.com/office/drawing/2016/5/12/chartex" xmlns:cx7="http://schemas.microsoft.com/office/drawing/2016/5/13/chartex" xmlns:cx8="http://schemas.microsoft.com/office/drawing/2016/5/14/chartex" xmlns:mc="http://schemas.openxmlformats.org/markup-compatibility/2006" xmlns:m="http://schemas.openxmlformats.org/officeDocument/2006/math" xmlns:aink="http://schemas.microsoft.com/office/drawing/2016/ink" xmlns:am3d="http://schemas.microsoft.com/office/drawing/2017/model3d" xmlns:oel="http://schemas.microsoft.com/office/2019/extlst" xmlns:r="http://schemas.openxmlformats.org/officeDocument/2006/relationships" xmlns:wp14="http://schemas.microsoft.com/office/word/2010/wordprocessingDrawing" xmlns:wp="http://schemas.openxmlformats.org/drawingml/2006/wordprocessingDrawing" xmlns:wpg="http://schemas.microsoft.com/office/word/2010/wordprocessingGroup" xmlns:wpi="http://schemas.microsoft.com/office/word/2010/wordprocessingInk" xmlns:wps="http://schemas.microsoft.com/office/word/2010/wordprocessingShape" xmlns:o="urn:schemas-microsoft-com:office:office" xmlns:v="urn:schemas-microsoft-com:vml" xmlns:w10="urn:schemas-microsoft-com:office:word" xmlns:w="http://schemas.openxmlformats.org/wordprocessingml/2006/main" xmlns:w14="http://schemas.microsoft.com/office/word/2010/wordml" xmlns:w15="http://schemas.microsoft.com/office/word/2012/wordml" xmlns:w16cex="http://schemas.microsoft.com/office/word/2018/wordml/cex" xmlns:w16cid="http://schemas.microsoft.com/office/word/2016/wordml/cid" xmlns:w16="http://schemas.microsoft.com/office/word/2018/wordml" xmlns:w16sdtdh="http://schemas.microsoft.com/office/word/2020/wordml/sdtdatahash" xmlns:w16sdtfl="http://schemas.microsoft.com/office/word/2024/wordml/sdtformatlock" xmlns:w16se="http://schemas.microsoft.com/office/word/2015/wordml/symex" xmlns:w16du="http://schemas.microsoft.com/office/word/2023/wordml/word16du" xmlns:wne="http://schemas.microsoft.com/office/word/2006/wordml" mc:Ignorable="w14 w15 w16se w16cid w16 w16cex w16sdtdh w16sdtfl w16du wp14">
   <w:footnote w:type="separator" w:id="-1">
     <w:p>
       <w:pPr>
@@ -2825,7 +2823,7 @@
 </file>
 
 <file path=word/header1.xml><?xml version="1.0" encoding="utf-8"?>
-<w:hdr xmlns:wpc="http://schemas.microsoft.com/office/word/2010/wordprocessingCanvas" xmlns:cx="http://schemas.microsoft.com/office/drawing/2014/chartex" xmlns:cx1="http://schemas.microsoft.com/office/drawing/2015/9/8/chartex" xmlns:cx2="http://schemas.microsoft.com/office/drawing/2015/10/21/chartex" xmlns:cx3="http://schemas.microsoft.com/office/drawing/2016/5/9/chartex" xmlns:cx4="http://schemas.microsoft.com/office/drawing/2016/5/10/chartex" xmlns:cx5="http://schemas.microsoft.com/office/drawing/2016/5/11/chartex" xmlns:cx6="http://schemas.microsoft.com/office/drawing/2016/5/12/chartex" xmlns:cx7="http://schemas.microsoft.com/office/drawing/2016/5/13/chartex" xmlns:cx8="http://schemas.microsoft.com/office/drawing/2016/5/14/chartex" xmlns:mc="http://schemas.openxmlformats.org/markup-compatibility/2006" xmlns:aink="http://schemas.microsoft.com/office/drawing/2016/ink" xmlns:am3d="http://schemas.microsoft.com/office/drawing/2017/model3d" xmlns:o="urn:schemas-microsoft-com:office:office" xmlns:oel="http://schemas.microsoft.com/office/2019/extlst" xmlns:r="http://schemas.openxmlformats.org/officeDocument/2006/relationships" xmlns:m="http://schemas.openxmlformats.org/officeDocument/2006/math" xmlns:v="urn:schemas-microsoft-com:vml" xmlns:wp14="http://schemas.microsoft.com/office/word/2010/wordprocessingDrawing" xmlns:wp="http://schemas.openxmlformats.org/drawingml/2006/wordprocessingDrawing" xmlns:w10="urn:schemas-microsoft-com:office:word" xmlns:w="http://schemas.openxmlformats.org/wordprocessingml/2006/main" xmlns:w14="http://schemas.microsoft.com/office/word/2010/wordml" xmlns:w15="http://schemas.microsoft.com/office/word/2012/wordml" xmlns:w16cex="http://schemas.microsoft.com/office/word/2018/wordml/cex" xmlns:w16cid="http://schemas.microsoft.com/office/word/2016/wordml/cid" xmlns:w16="http://schemas.microsoft.com/office/word/2018/wordml" xmlns:w16sdtdh="http://schemas.microsoft.com/office/word/2020/wordml/sdtdatahash" xmlns:w16se="http://schemas.microsoft.com/office/word/2015/wordml/symex" xmlns:wpg="http://schemas.microsoft.com/office/word/2010/wordprocessingGroup" xmlns:wpi="http://schemas.microsoft.com/office/word/2010/wordprocessingInk" xmlns:wne="http://schemas.microsoft.com/office/word/2006/wordml" xmlns:wps="http://schemas.microsoft.com/office/word/2010/wordprocessingShape" mc:Ignorable="w14 w15 w16se w16cid w16 w16cex w16sdtdh wp14">
+<w:hdr xmlns:wpc="http://schemas.microsoft.com/office/word/2010/wordprocessingCanvas" xmlns:cx="http://schemas.microsoft.com/office/drawing/2014/chartex" xmlns:cx1="http://schemas.microsoft.com/office/drawing/2015/9/8/chartex" xmlns:cx2="http://schemas.microsoft.com/office/drawing/2015/10/21/chartex" xmlns:cx3="http://schemas.microsoft.com/office/drawing/2016/5/9/chartex" xmlns:cx4="http://schemas.microsoft.com/office/drawing/2016/5/10/chartex" xmlns:cx5="http://schemas.microsoft.com/office/drawing/2016/5/11/chartex" xmlns:cx6="http://schemas.microsoft.com/office/drawing/2016/5/12/chartex" xmlns:cx7="http://schemas.microsoft.com/office/drawing/2016/5/13/chartex" xmlns:cx8="http://schemas.microsoft.com/office/drawing/2016/5/14/chartex" xmlns:mc="http://schemas.openxmlformats.org/markup-compatibility/2006" xmlns:m="http://schemas.openxmlformats.org/officeDocument/2006/math" xmlns:aink="http://schemas.microsoft.com/office/drawing/2016/ink" xmlns:am3d="http://schemas.microsoft.com/office/drawing/2017/model3d" xmlns:oel="http://schemas.microsoft.com/office/2019/extlst" xmlns:r="http://schemas.openxmlformats.org/officeDocument/2006/relationships" xmlns:wp14="http://schemas.microsoft.com/office/word/2010/wordprocessingDrawing" xmlns:wp="http://schemas.openxmlformats.org/drawingml/2006/wordprocessingDrawing" xmlns:wpg="http://schemas.microsoft.com/office/word/2010/wordprocessingGroup" xmlns:wpi="http://schemas.microsoft.com/office/word/2010/wordprocessingInk" xmlns:wps="http://schemas.microsoft.com/office/word/2010/wordprocessingShape" xmlns:o="urn:schemas-microsoft-com:office:office" xmlns:v="urn:schemas-microsoft-com:vml" xmlns:w10="urn:schemas-microsoft-com:office:word" xmlns:w="http://schemas.openxmlformats.org/wordprocessingml/2006/main" xmlns:w14="http://schemas.microsoft.com/office/word/2010/wordml" xmlns:w15="http://schemas.microsoft.com/office/word/2012/wordml" xmlns:w16cex="http://schemas.microsoft.com/office/word/2018/wordml/cex" xmlns:w16cid="http://schemas.microsoft.com/office/word/2016/wordml/cid" xmlns:w16="http://schemas.microsoft.com/office/word/2018/wordml" xmlns:w16sdtdh="http://schemas.microsoft.com/office/word/2020/wordml/sdtdatahash" xmlns:w16sdtfl="http://schemas.microsoft.com/office/word/2024/wordml/sdtformatlock" xmlns:w16se="http://schemas.microsoft.com/office/word/2015/wordml/symex" xmlns:w16du="http://schemas.microsoft.com/office/word/2023/wordml/word16du" xmlns:wne="http://schemas.microsoft.com/office/word/2006/wordml" mc:Ignorable="w14 w15 w16se w16cid w16 w16cex w16sdtdh w16sdtfl w16du wp14">
   <w:p>
     <w:pPr>
       <w:pStyle w:val="a5"/>
@@ -2835,7 +2833,7 @@
 </file>
 
 <file path=word/numbering.xml><?xml version="1.0" encoding="utf-8"?>
-<w:numbering xmlns:wpc="http://schemas.microsoft.com/office/word/2010/wordprocessingCanvas" xmlns:cx="http://schemas.microsoft.com/office/drawing/2014/chartex" xmlns:cx1="http://schemas.microsoft.com/office/drawing/2015/9/8/chartex" xmlns:cx2="http://schemas.microsoft.com/office/drawing/2015/10/21/chartex" xmlns:cx3="http://schemas.microsoft.com/office/drawing/2016/5/9/chartex" xmlns:cx4="http://schemas.microsoft.com/office/drawing/2016/5/10/chartex" xmlns:cx5="http://schemas.microsoft.com/office/drawing/2016/5/11/chartex" xmlns:cx6="http://schemas.microsoft.com/office/drawing/2016/5/12/chartex" xmlns:cx7="http://schemas.microsoft.com/office/drawing/2016/5/13/chartex" xmlns:cx8="http://schemas.microsoft.com/office/drawing/2016/5/14/chartex" xmlns:mc="http://schemas.openxmlformats.org/markup-compatibility/2006" xmlns:aink="http://schemas.microsoft.com/office/drawing/2016/ink" xmlns:am3d="http://schemas.microsoft.com/office/drawing/2017/model3d" xmlns:o="urn:schemas-microsoft-com:office:office" xmlns:oel="http://schemas.microsoft.com/office/2019/extlst" xmlns:r="http://schemas.openxmlformats.org/officeDocument/2006/relationships" xmlns:m="http://schemas.openxmlformats.org/officeDocument/2006/math" xmlns:v="urn:schemas-microsoft-com:vml" xmlns:wp14="http://schemas.microsoft.com/office/word/2010/wordprocessingDrawing" xmlns:wp="http://schemas.openxmlformats.org/drawingml/2006/wordprocessingDrawing" xmlns:w10="urn:schemas-microsoft-com:office:word" xmlns:w="http://schemas.openxmlformats.org/wordprocessingml/2006/main" xmlns:w14="http://schemas.microsoft.com/office/word/2010/wordml" xmlns:w15="http://schemas.microsoft.com/office/word/2012/wordml" xmlns:w16cex="http://schemas.microsoft.com/office/word/2018/wordml/cex" xmlns:w16cid="http://schemas.microsoft.com/office/word/2016/wordml/cid" xmlns:w16="http://schemas.microsoft.com/office/word/2018/wordml" xmlns:w16sdtdh="http://schemas.microsoft.com/office/word/2020/wordml/sdtdatahash" xmlns:w16se="http://schemas.microsoft.com/office/word/2015/wordml/symex" xmlns:wpg="http://schemas.microsoft.com/office/word/2010/wordprocessingGroup" xmlns:wpi="http://schemas.microsoft.com/office/word/2010/wordprocessingInk" xmlns:wne="http://schemas.microsoft.com/office/word/2006/wordml" xmlns:wps="http://schemas.microsoft.com/office/word/2010/wordprocessingShape" mc:Ignorable="w14 w15 w16se w16cid w16 w16cex w16sdtdh wp14">
+<w:numbering xmlns:wpc="http://schemas.microsoft.com/office/word/2010/wordprocessingCanvas" xmlns:cx="http://schemas.microsoft.com/office/drawing/2014/chartex" xmlns:cx1="http://schemas.microsoft.com/office/drawing/2015/9/8/chartex" xmlns:cx2="http://schemas.microsoft.com/office/drawing/2015/10/21/chartex" xmlns:cx3="http://schemas.microsoft.com/office/drawing/2016/5/9/chartex" xmlns:cx4="http://schemas.microsoft.com/office/drawing/2016/5/10/chartex" xmlns:cx5="http://schemas.microsoft.com/office/drawing/2016/5/11/chartex" xmlns:cx6="http://schemas.microsoft.com/office/drawing/2016/5/12/chartex" xmlns:cx7="http://schemas.microsoft.com/office/drawing/2016/5/13/chartex" xmlns:cx8="http://schemas.microsoft.com/office/drawing/2016/5/14/chartex" xmlns:mc="http://schemas.openxmlformats.org/markup-compatibility/2006" xmlns:m="http://schemas.openxmlformats.org/officeDocument/2006/math" xmlns:aink="http://schemas.microsoft.com/office/drawing/2016/ink" xmlns:am3d="http://schemas.microsoft.com/office/drawing/2017/model3d" xmlns:oel="http://schemas.microsoft.com/office/2019/extlst" xmlns:r="http://schemas.openxmlformats.org/officeDocument/2006/relationships" xmlns:wp14="http://schemas.microsoft.com/office/word/2010/wordprocessingDrawing" xmlns:wp="http://schemas.openxmlformats.org/drawingml/2006/wordprocessingDrawing" xmlns:wpg="http://schemas.microsoft.com/office/word/2010/wordprocessingGroup" xmlns:wpi="http://schemas.microsoft.com/office/word/2010/wordprocessingInk" xmlns:wps="http://schemas.microsoft.com/office/word/2010/wordprocessingShape" xmlns:o="urn:schemas-microsoft-com:office:office" xmlns:v="urn:schemas-microsoft-com:vml" xmlns:w10="urn:schemas-microsoft-com:office:word" xmlns:w="http://schemas.openxmlformats.org/wordprocessingml/2006/main" xmlns:w14="http://schemas.microsoft.com/office/word/2010/wordml" xmlns:w15="http://schemas.microsoft.com/office/word/2012/wordml" xmlns:w16cex="http://schemas.microsoft.com/office/word/2018/wordml/cex" xmlns:w16cid="http://schemas.microsoft.com/office/word/2016/wordml/cid" xmlns:w16="http://schemas.microsoft.com/office/word/2018/wordml" xmlns:w16sdtdh="http://schemas.microsoft.com/office/word/2020/wordml/sdtdatahash" xmlns:w16sdtfl="http://schemas.microsoft.com/office/word/2024/wordml/sdtformatlock" xmlns:w16se="http://schemas.microsoft.com/office/word/2015/wordml/symex" xmlns:w16du="http://schemas.microsoft.com/office/word/2023/wordml/word16du" xmlns:wne="http://schemas.microsoft.com/office/word/2006/wordml" mc:Ignorable="w14 w15 w16se w16cid w16 w16cex w16sdtdh w16sdtfl w16du wp14">
   <w:abstractNum w:abstractNumId="0" w15:restartNumberingAfterBreak="0">
     <w:nsid w:val="0389405D"/>
     <w:multiLevelType w:val="multilevel"/>
@@ -3865,7 +3863,7 @@
         <w:ind w:left="720" w:hanging="360"/>
       </w:pPr>
       <w:rPr>
-        <w:rFonts w:ascii="等线" w:eastAsia="等线" w:hAnsi="等线" w:cs="Times New Roman" w:hint="eastAsia"/>
+        <w:rFonts w:ascii="DengXian" w:eastAsia="DengXian" w:hAnsi="DengXian" w:cs="Times New Roman" w:hint="eastAsia"/>
       </w:rPr>
     </w:lvl>
     <w:lvl w:ilvl="1" w:tplc="04090003" w:tentative="1">
@@ -4695,7 +4693,7 @@
 </file>
 
 <file path=word/styles.xml><?xml version="1.0" encoding="utf-8"?>
-<w:styles xmlns:mc="http://schemas.openxmlformats.org/markup-compatibility/2006" xmlns:r="http://schemas.openxmlformats.org/officeDocument/2006/relationships" xmlns:w="http://schemas.openxmlformats.org/wordprocessingml/2006/main" xmlns:w14="http://schemas.microsoft.com/office/word/2010/wordml" xmlns:w15="http://schemas.microsoft.com/office/word/2012/wordml" xmlns:w16cex="http://schemas.microsoft.com/office/word/2018/wordml/cex" xmlns:w16cid="http://schemas.microsoft.com/office/word/2016/wordml/cid" xmlns:w16="http://schemas.microsoft.com/office/word/2018/wordml" xmlns:w16sdtdh="http://schemas.microsoft.com/office/word/2020/wordml/sdtdatahash" xmlns:w16se="http://schemas.microsoft.com/office/word/2015/wordml/symex" mc:Ignorable="w14 w15 w16se w16cid w16 w16cex w16sdtdh">
+<w:styles xmlns:mc="http://schemas.openxmlformats.org/markup-compatibility/2006" xmlns:r="http://schemas.openxmlformats.org/officeDocument/2006/relationships" xmlns:w="http://schemas.openxmlformats.org/wordprocessingml/2006/main" xmlns:w14="http://schemas.microsoft.com/office/word/2010/wordml" xmlns:w15="http://schemas.microsoft.com/office/word/2012/wordml" xmlns:w16cex="http://schemas.microsoft.com/office/word/2018/wordml/cex" xmlns:w16cid="http://schemas.microsoft.com/office/word/2016/wordml/cid" xmlns:w16="http://schemas.microsoft.com/office/word/2018/wordml" xmlns:w16sdtdh="http://schemas.microsoft.com/office/word/2020/wordml/sdtdatahash" xmlns:w16sdtfl="http://schemas.microsoft.com/office/word/2024/wordml/sdtformatlock" xmlns:w16se="http://schemas.microsoft.com/office/word/2015/wordml/symex" xmlns:w16du="http://schemas.microsoft.com/office/word/2023/wordml/word16du" mc:Ignorable="w14 w15 w16se w16cid w16 w16cex w16sdtdh w16sdtfl w16du">
   <w:docDefaults>
     <w:rPrDefault>
       <w:rPr>

</xml_diff>

<commit_message>
Update master's degree title and manuscript status in CV
</commit_message>
<xml_diff>
--- a/JiachengGao-CV/Jiacheng Gao CV.docx
+++ b/JiachengGao-CV/Jiacheng Gao CV.docx
@@ -341,7 +341,23 @@
           <w:sz w:val="21"/>
           <w:szCs w:val="21"/>
         </w:rPr>
-        <w:t xml:space="preserve"> of Science in Computer Science and Technolog</w:t>
+        <w:t xml:space="preserve"> of </w:t>
+      </w:r>
+      <w:r>
+        <w:rPr>
+          <w:rFonts w:ascii="Times New Roman" w:hAnsi="Times New Roman" w:cs="Times New Roman" w:hint="eastAsia"/>
+          <w:sz w:val="21"/>
+          <w:szCs w:val="21"/>
+        </w:rPr>
+        <w:t xml:space="preserve">Engineering </w:t>
+      </w:r>
+      <w:r>
+        <w:rPr>
+          <w:rFonts w:ascii="Times New Roman" w:hAnsi="Times New Roman" w:cs="Times New Roman"/>
+          <w:sz w:val="21"/>
+          <w:szCs w:val="21"/>
+        </w:rPr>
+        <w:t>in Computer Science and Technolog</w:t>
       </w:r>
       <w:r>
         <w:rPr>
@@ -458,7 +474,16 @@
           <w:sz w:val="21"/>
           <w:szCs w:val="21"/>
         </w:rPr>
-        <w:t>Information and Computational Science</w:t>
+        <w:t xml:space="preserve">Information and Computational </w:t>
+      </w:r>
+      <w:proofErr w:type="gramStart"/>
+      <w:r>
+        <w:rPr>
+          <w:rFonts w:ascii="Times New Roman" w:hAnsi="Times New Roman" w:cs="Times New Roman"/>
+          <w:sz w:val="21"/>
+          <w:szCs w:val="21"/>
+        </w:rPr>
+        <w:t>Science</w:t>
       </w:r>
       <w:r>
         <w:rPr>
@@ -478,7 +503,18 @@
           <w:sz w:val="21"/>
           <w:szCs w:val="21"/>
         </w:rPr>
-        <w:t xml:space="preserve">| GPA: </w:t>
+        <w:t>|</w:t>
+      </w:r>
+      <w:proofErr w:type="gramEnd"/>
+      <w:r>
+        <w:rPr>
+          <w:rFonts w:ascii="Times New Roman" w:hAnsi="Times New Roman" w:cs="Times New Roman"/>
+          <w:b/>
+          <w:bCs/>
+          <w:sz w:val="21"/>
+          <w:szCs w:val="21"/>
+        </w:rPr>
+        <w:t xml:space="preserve"> GPA: </w:t>
       </w:r>
       <w:r>
         <w:rPr>
@@ -1016,23 +1052,15 @@
           <w:sz w:val="21"/>
           <w:szCs w:val="21"/>
         </w:rPr>
-        <w:t xml:space="preserve">s; one </w:t>
-      </w:r>
-      <w:r>
-        <w:rPr>
-          <w:rFonts w:ascii="Times New Roman" w:hAnsi="Times New Roman" w:cs="Times New Roman"/>
-          <w:sz w:val="21"/>
-          <w:szCs w:val="21"/>
-        </w:rPr>
-        <w:t>under revie</w:t>
-      </w:r>
-      <w:r>
-        <w:rPr>
-          <w:rFonts w:ascii="Times New Roman" w:hAnsi="Times New Roman" w:cs="Times New Roman" w:hint="eastAsia"/>
-          <w:sz w:val="21"/>
-          <w:szCs w:val="21"/>
-        </w:rPr>
-        <w:t>w</w:t>
+        <w:t>s; one</w:t>
+      </w:r>
+      <w:r>
+        <w:rPr>
+          <w:rFonts w:ascii="Times New Roman" w:hAnsi="Times New Roman" w:cs="Times New Roman"/>
+          <w:sz w:val="21"/>
+          <w:szCs w:val="21"/>
+        </w:rPr>
+        <w:t xml:space="preserve"> manuscript in preparation</w:t>
       </w:r>
       <w:r>
         <w:rPr>

</xml_diff>